<commit_message>
docs(gmud-214): remove escopo de Data de Preparacao (US separada)
Ajusta a documentacao da GMUD 214 para refletir o escopo real da subida:
apenas o estado EX (Expedicao) do STATUSPICKING, a acao de tela EP->PF e o
JAR voke230626.jar. Remove os objetos e regras de Data de Preparacao
(coluna DATA_PREPARACAO_INTEGRADA, procedure STP_AD_PLANROL_DTPRE, view
VIEW_VOKE_ITSM_ATIVACAO_PEDIDO e RN01-RN08), que sao tratados em US separada.

Co-Authored-By: Claude Opus 4.8 <noreply@anthropic.com>
Claude-Session: https://claude.ai/code/session_01LJMH2nbtMEkmaUENEVh6N8
</commit_message>
<xml_diff>
--- a/docs/gmud-214-ativacao-pedidos-itsm/GMUD-214-Subida-Producao-Ativacao-Pedidos-ITSM.docx
+++ b/docs/gmud-214-ativacao-pedidos-itsm/GMUD-214-Subida-Producao-Ativacao-Pedidos-ITSM.docx
@@ -690,7 +690,7 @@
           <w:szCs w:val="21"/>
           <w:rFonts w:ascii="Arial" w:cs="Arial" w:eastAsia="Arial" w:hAnsi="Arial"/>
         </w:rPr>
-        <w:t xml:space="preserve"> da integração Sankhya × VokeNext/Run2Biz, cobrindo três frentes:</w:t>
+        <w:t xml:space="preserve"> da integração Sankhya × VokeNext/Run2Biz, em duas frentes:</w:t>
       </w:r>
     </w:p>
     <w:p>
@@ -711,16 +711,16 @@
           <w:szCs w:val="21"/>
           <w:rFonts w:ascii="Arial" w:cs="Arial" w:eastAsia="Arial" w:hAnsi="Arial"/>
         </w:rPr>
-        <w:t xml:space="preserve">Data de Preparação no chamado — </w:t>
-      </w:r>
-      <w:r>
-        <w:rPr>
-          <w:color w:val="222222"/>
-          <w:sz w:val="21"/>
-          <w:szCs w:val="21"/>
-          <w:rFonts w:ascii="Arial" w:cs="Arial" w:eastAsia="Arial" w:hAnsi="Arial"/>
-        </w:rPr>
-        <w:t xml:space="preserve">disponibiliza a Data de Preparação do Pedido de Venda (rollout) no payload de criação/atualização dos chamados enviados ao Run2Biz, nos dois cenários (antes e depois de o chamado existir).</w:t>
+        <w:t xml:space="preserve">Estado "Expedição" (EX) — </w:t>
+      </w:r>
+      <w:r>
+        <w:rPr>
+          <w:color w:val="222222"/>
+          <w:sz w:val="21"/>
+          <w:szCs w:val="21"/>
+          <w:rFonts w:ascii="Arial" w:cs="Arial" w:eastAsia="Arial" w:hAnsi="Arial"/>
+        </w:rPr>
+        <w:t xml:space="preserve">novo valor de domínio do STATUSPICKING, refletindo no Gerenciamento Integração a etapa de Expedição já acionada no Run2Biz (gravada na transição NE → EX pelo ScheduleEnviarDadosNota).</w:t>
       </w:r>
     </w:p>
     <w:p>
@@ -741,27 +741,31 @@
           <w:szCs w:val="21"/>
           <w:rFonts w:ascii="Arial" w:cs="Arial" w:eastAsia="Arial" w:hAnsi="Arial"/>
         </w:rPr>
-        <w:t xml:space="preserve">Estado "Expedição" (EX) — </w:t>
-      </w:r>
-      <w:r>
-        <w:rPr>
-          <w:color w:val="222222"/>
-          <w:sz w:val="21"/>
-          <w:szCs w:val="21"/>
-          <w:rFonts w:ascii="Arial" w:cs="Arial" w:eastAsia="Arial" w:hAnsi="Arial"/>
-        </w:rPr>
-        <w:t xml:space="preserve">novo valor de domínio do STATUSPICKING, refletindo no Gerenciamento Integração a etapa de Expedição já acionada no Run2Biz.</w:t>
-      </w:r>
-    </w:p>
-    <w:p>
-      <w:pPr>
-        <w:pStyle w:val="ListParagraph"/>
-        <w:numPr>
-          <w:ilvl w:val="0"/>
-          <w:numId w:val="1"/>
-        </w:numPr>
-        <w:spacing w:after="60" w:line="264"/>
-      </w:pPr>
+        <w:t xml:space="preserve">Ação de avanço de status — </w:t>
+      </w:r>
+      <w:r>
+        <w:rPr>
+          <w:color w:val="222222"/>
+          <w:sz w:val="21"/>
+          <w:szCs w:val="21"/>
+          <w:rFonts w:ascii="Arial" w:cs="Arial" w:eastAsia="Arial" w:hAnsi="Arial"/>
+        </w:rPr>
+        <w:t xml:space="preserve">botão "Avançar Para Preparação Finalizada" (transição EP → PF) na tela Gerenciamento Integração.</w:t>
+      </w:r>
+    </w:p>
+    <w:p>
+      <w:pPr>
+        <w:spacing w:after="100" w:line="276"/>
+      </w:pPr>
+      <w:r>
+        <w:rPr>
+          <w:color w:val="222222"/>
+          <w:sz w:val="21"/>
+          <w:szCs w:val="21"/>
+          <w:rFonts w:ascii="Arial" w:cs="Arial" w:eastAsia="Arial" w:hAnsi="Arial"/>
+        </w:rPr>
+        <w:t xml:space="preserve">O documento registra o </w:t>
+      </w:r>
       <w:r>
         <w:rPr>
           <w:b/>
@@ -771,30 +775,16 @@
           <w:szCs w:val="21"/>
           <w:rFonts w:ascii="Arial" w:cs="Arial" w:eastAsia="Arial" w:hAnsi="Arial"/>
         </w:rPr>
-        <w:t xml:space="preserve">Ação de avanço de status — </w:t>
-      </w:r>
-      <w:r>
-        <w:rPr>
-          <w:color w:val="222222"/>
-          <w:sz w:val="21"/>
-          <w:szCs w:val="21"/>
-          <w:rFonts w:ascii="Arial" w:cs="Arial" w:eastAsia="Arial" w:hAnsi="Arial"/>
-        </w:rPr>
-        <w:t xml:space="preserve">botão "Avançar Para Preparação Finalizada" (transição EP → PF) na tela Gerenciamento Integração.</w:t>
-      </w:r>
-    </w:p>
-    <w:p>
-      <w:pPr>
-        <w:spacing w:after="100" w:line="276"/>
-      </w:pPr>
-      <w:r>
-        <w:rPr>
-          <w:color w:val="222222"/>
-          <w:sz w:val="21"/>
-          <w:szCs w:val="21"/>
-          <w:rFonts w:ascii="Arial" w:cs="Arial" w:eastAsia="Arial" w:hAnsi="Arial"/>
-        </w:rPr>
-        <w:t xml:space="preserve">O documento registra os </w:t>
+        <w:t xml:space="preserve">objeto de banco</w:t>
+      </w:r>
+      <w:r>
+        <w:rPr>
+          <w:color w:val="222222"/>
+          <w:sz w:val="21"/>
+          <w:szCs w:val="21"/>
+          <w:rFonts w:ascii="Arial" w:cs="Arial" w:eastAsia="Arial" w:hAnsi="Arial"/>
+        </w:rPr>
+        <w:t xml:space="preserve">, o </w:t>
       </w:r>
       <w:r>
         <w:rPr>
@@ -805,16 +795,16 @@
           <w:szCs w:val="21"/>
           <w:rFonts w:ascii="Arial" w:cs="Arial" w:eastAsia="Arial" w:hAnsi="Arial"/>
         </w:rPr>
-        <w:t xml:space="preserve">objetos de banco</w:t>
-      </w:r>
-      <w:r>
-        <w:rPr>
-          <w:color w:val="222222"/>
-          <w:sz w:val="21"/>
-          <w:szCs w:val="21"/>
-          <w:rFonts w:ascii="Arial" w:cs="Arial" w:eastAsia="Arial" w:hAnsi="Arial"/>
-        </w:rPr>
-        <w:t xml:space="preserve">, o </w:t>
+        <w:t xml:space="preserve">artefato de aplicação (JAR)</w:t>
+      </w:r>
+      <w:r>
+        <w:rPr>
+          <w:color w:val="222222"/>
+          <w:sz w:val="21"/>
+          <w:szCs w:val="21"/>
+          <w:rFonts w:ascii="Arial" w:cs="Arial" w:eastAsia="Arial" w:hAnsi="Arial"/>
+        </w:rPr>
+        <w:t xml:space="preserve">, as </w:t>
       </w:r>
       <w:r>
         <w:rPr>
@@ -825,16 +815,16 @@
           <w:szCs w:val="21"/>
           <w:rFonts w:ascii="Arial" w:cs="Arial" w:eastAsia="Arial" w:hAnsi="Arial"/>
         </w:rPr>
-        <w:t xml:space="preserve">artefato de aplicação (JAR)</w:t>
-      </w:r>
-      <w:r>
-        <w:rPr>
-          <w:color w:val="222222"/>
-          <w:sz w:val="21"/>
-          <w:szCs w:val="21"/>
-          <w:rFonts w:ascii="Arial" w:cs="Arial" w:eastAsia="Arial" w:hAnsi="Arial"/>
-        </w:rPr>
-        <w:t xml:space="preserve">, as </w:t>
+        <w:t xml:space="preserve">ações agendadas</w:t>
+      </w:r>
+      <w:r>
+        <w:rPr>
+          <w:color w:val="222222"/>
+          <w:sz w:val="21"/>
+          <w:szCs w:val="21"/>
+          <w:rFonts w:ascii="Arial" w:cs="Arial" w:eastAsia="Arial" w:hAnsi="Arial"/>
+        </w:rPr>
+        <w:t xml:space="preserve"> do módulo, a </w:t>
       </w:r>
       <w:r>
         <w:rPr>
@@ -845,16 +835,16 @@
           <w:szCs w:val="21"/>
           <w:rFonts w:ascii="Arial" w:cs="Arial" w:eastAsia="Arial" w:hAnsi="Arial"/>
         </w:rPr>
-        <w:t xml:space="preserve">ações agendadas</w:t>
-      </w:r>
-      <w:r>
-        <w:rPr>
-          <w:color w:val="222222"/>
-          <w:sz w:val="21"/>
-          <w:szCs w:val="21"/>
-          <w:rFonts w:ascii="Arial" w:cs="Arial" w:eastAsia="Arial" w:hAnsi="Arial"/>
-        </w:rPr>
-        <w:t xml:space="preserve">, as </w:t>
+        <w:t xml:space="preserve">ação de tela</w:t>
+      </w:r>
+      <w:r>
+        <w:rPr>
+          <w:color w:val="222222"/>
+          <w:sz w:val="21"/>
+          <w:szCs w:val="21"/>
+          <w:rFonts w:ascii="Arial" w:cs="Arial" w:eastAsia="Arial" w:hAnsi="Arial"/>
+        </w:rPr>
+        <w:t xml:space="preserve">, a </w:t>
       </w:r>
       <w:r>
         <w:rPr>
@@ -865,16 +855,16 @@
           <w:szCs w:val="21"/>
           <w:rFonts w:ascii="Arial" w:cs="Arial" w:eastAsia="Arial" w:hAnsi="Arial"/>
         </w:rPr>
-        <w:t xml:space="preserve">regras de negócio</w:t>
-      </w:r>
-      <w:r>
-        <w:rPr>
-          <w:color w:val="222222"/>
-          <w:sz w:val="21"/>
-          <w:szCs w:val="21"/>
-          <w:rFonts w:ascii="Arial" w:cs="Arial" w:eastAsia="Arial" w:hAnsi="Arial"/>
-        </w:rPr>
-        <w:t xml:space="preserve"> atendidas, a </w:t>
+        <w:t xml:space="preserve">ordem de deploy</w:t>
+      </w:r>
+      <w:r>
+        <w:rPr>
+          <w:color w:val="222222"/>
+          <w:sz w:val="21"/>
+          <w:szCs w:val="21"/>
+          <w:rFonts w:ascii="Arial" w:cs="Arial" w:eastAsia="Arial" w:hAnsi="Arial"/>
+        </w:rPr>
+        <w:t xml:space="preserve"> e as </w:t>
       </w:r>
       <w:r>
         <w:rPr>
@@ -885,36 +875,48 @@
           <w:szCs w:val="21"/>
           <w:rFonts w:ascii="Arial" w:cs="Arial" w:eastAsia="Arial" w:hAnsi="Arial"/>
         </w:rPr>
-        <w:t xml:space="preserve">ordem de deploy</w:t>
-      </w:r>
-      <w:r>
-        <w:rPr>
-          <w:color w:val="222222"/>
-          <w:sz w:val="21"/>
-          <w:szCs w:val="21"/>
-          <w:rFonts w:ascii="Arial" w:cs="Arial" w:eastAsia="Arial" w:hAnsi="Arial"/>
-        </w:rPr>
-        <w:t xml:space="preserve"> e as </w:t>
-      </w:r>
+        <w:t xml:space="preserve">evidências</w:t>
+      </w:r>
+      <w:r>
+        <w:rPr>
+          <w:color w:val="222222"/>
+          <w:sz w:val="21"/>
+          <w:szCs w:val="21"/>
+          <w:rFonts w:ascii="Arial" w:cs="Arial" w:eastAsia="Arial" w:hAnsi="Arial"/>
+        </w:rPr>
+        <w:t xml:space="preserve"> coletadas na subida.</w:t>
+      </w:r>
+    </w:p>
+    <w:p>
+      <w:pPr>
+        <w:pBdr>
+          <w:top w:val="single" w:color="9CC79C" w:sz="4"/>
+          <w:bottom w:val="single" w:color="9CC79C" w:sz="4"/>
+          <w:left w:val="single" w:color="3E8E3E" w:sz="18"/>
+          <w:right w:val="single" w:color="9CC79C" w:sz="4"/>
+        </w:pBdr>
+        <w:shd w:fill="EEF6EE" w:val="clear"/>
+        <w:spacing w:before="80" w:after="120"/>
+      </w:pPr>
       <w:r>
         <w:rPr>
           <w:b/>
           <w:bCs/>
-          <w:color w:val="222222"/>
-          <w:sz w:val="21"/>
-          <w:szCs w:val="21"/>
-          <w:rFonts w:ascii="Arial" w:cs="Arial" w:eastAsia="Arial" w:hAnsi="Arial"/>
-        </w:rPr>
-        <w:t xml:space="preserve">evidências</w:t>
-      </w:r>
-      <w:r>
-        <w:rPr>
-          <w:color w:val="222222"/>
-          <w:sz w:val="21"/>
-          <w:szCs w:val="21"/>
-          <w:rFonts w:ascii="Arial" w:cs="Arial" w:eastAsia="Arial" w:hAnsi="Arial"/>
-        </w:rPr>
-        <w:t xml:space="preserve"> coletadas na subida.</w:t>
+          <w:color w:val="2A6A2A"/>
+          <w:sz w:val="19"/>
+          <w:szCs w:val="19"/>
+          <w:rFonts w:ascii="Arial" w:cs="Arial" w:eastAsia="Arial" w:hAnsi="Arial"/>
+        </w:rPr>
+        <w:t xml:space="preserve">Fora de escopo desta GMUD: </w:t>
+      </w:r>
+      <w:r>
+        <w:rPr>
+          <w:color w:val="2A5A2A"/>
+          <w:sz w:val="19"/>
+          <w:szCs w:val="19"/>
+          <w:rFonts w:ascii="Arial" w:cs="Arial" w:eastAsia="Arial" w:hAnsi="Arial"/>
+        </w:rPr>
+        <w:t xml:space="preserve">a melhoria de Data de Preparação (envio da data ao chamado) está sendo tratada em uma US separada e não faz parte desta subida.</w:t>
       </w:r>
     </w:p>
     <w:p>
@@ -2329,7 +2331,7 @@
           <w:szCs w:val="30"/>
           <w:rFonts w:ascii="Arial" w:cs="Arial" w:eastAsia="Arial" w:hAnsi="Arial"/>
         </w:rPr>
-        <w:t xml:space="preserve">5. Objetos de banco subidos</w:t>
+        <w:t xml:space="preserve">5. Objeto de banco subido</w:t>
       </w:r>
     </w:p>
     <w:p>
@@ -2343,7 +2345,7 @@
           <w:szCs w:val="21"/>
           <w:rFonts w:ascii="Arial" w:cs="Arial" w:eastAsia="Arial" w:hAnsi="Arial"/>
         </w:rPr>
-        <w:t xml:space="preserve">Objetos versionados em </w:t>
+        <w:t xml:space="preserve">Objeto versionado em </w:t>
       </w:r>
       <w:r>
         <w:rPr>
@@ -2361,7 +2363,7 @@
           <w:szCs w:val="21"/>
           <w:rFonts w:ascii="Arial" w:cs="Arial" w:eastAsia="Arial" w:hAnsi="Arial"/>
         </w:rPr>
-        <w:t xml:space="preserve"> e aplicados no banco de produção como pré-requisito do JAR:</w:t>
+        <w:t xml:space="preserve"> e aplicado no banco de produção como pré-requisito do JAR:</w:t>
       </w:r>
     </w:p>
     <w:tbl>
@@ -2377,10 +2379,10 @@
         </w:tblBorders>
       </w:tblPr>
       <w:tblGrid>
-        <w:gridCol w:w="480"/>
+        <w:gridCol w:w="576"/>
         <w:gridCol w:w="2880"/>
-        <w:gridCol w:w="1728"/>
-        <w:gridCol w:w="4512"/>
+        <w:gridCol w:w="1920"/>
+        <w:gridCol w:w="4224"/>
       </w:tblGrid>
       <w:tr>
         <w:trPr>
@@ -2555,7 +2557,7 @@
                 <w:szCs w:val="17"/>
                 <w:rFonts w:ascii="Consolas" w:cs="Consolas" w:eastAsia="Consolas" w:hAnsi="Consolas"/>
               </w:rPr>
-              <w:t xml:space="preserve">AD_PLANROL.DATA_PREPARACAO_INTEGRADA</w:t>
+              <w:t xml:space="preserve">AD_TGFINTE.STATUSPICKING → opção EX</w:t>
             </w:r>
           </w:p>
         </w:tc>
@@ -2584,7 +2586,7 @@
                 <w:szCs w:val="19"/>
                 <w:rFonts w:ascii="Arial" w:cs="Arial" w:eastAsia="Arial" w:hAnsi="Arial"/>
               </w:rPr>
-              <w:t xml:space="preserve">Coluna (DDL) — DATE</w:t>
+              <w:t xml:space="preserve">Opção de domínio (TDDOPC)</w:t>
             </w:r>
           </w:p>
         </w:tc>
@@ -2613,352 +2615,7 @@
                 <w:szCs w:val="19"/>
                 <w:rFonts w:ascii="Arial" w:cs="Arial" w:eastAsia="Arial" w:hAnsi="Arial"/>
               </w:rPr>
-              <w:t xml:space="preserve">Controle de reenvio da Data de Preparação. Enquanto nula, a integração trata o pedido como pendente; após o envio, o controller grava o writeback (data/hora), evitando redundância. Ideal criar pela tela Dicionário de Dados (registro no TDD exigido pelo JapeWrapper). Script: ALTER_AD_PLANROL_DATA_PREPARACAO_INTEGRADA.sql</w:t>
-            </w:r>
-          </w:p>
-        </w:tc>
-      </w:tr>
-      <w:tr>
-        <w:tc>
-          <w:tcPr>
-            <w:shd w:fill="EEF2F7" w:val="clear"/>
-            <w:tcMar>
-              <w:top w:type="dxa" w:w="60"/>
-              <w:left w:type="dxa" w:w="90"/>
-              <w:bottom w:type="dxa" w:w="60"/>
-              <w:right w:type="dxa" w:w="90"/>
-            </w:tcMar>
-            <w:vAlign w:val="center"/>
-          </w:tcPr>
-          <w:p>
-            <w:pPr>
-              <w:spacing w:after="20" w:line="252"/>
-              <w:jc w:val="left"/>
-            </w:pPr>
-            <w:r>
-              <w:rPr>
-                <w:b w:val="false"/>
-                <w:bCs w:val="false"/>
-                <w:color w:val="222222"/>
-                <w:sz w:val="19"/>
-                <w:szCs w:val="19"/>
-                <w:rFonts w:ascii="Arial" w:cs="Arial" w:eastAsia="Arial" w:hAnsi="Arial"/>
-              </w:rPr>
-              <w:t xml:space="preserve">2</w:t>
-            </w:r>
-          </w:p>
-        </w:tc>
-        <w:tc>
-          <w:tcPr>
-            <w:shd w:fill="EEF2F7" w:val="clear"/>
-            <w:tcMar>
-              <w:top w:type="dxa" w:w="60"/>
-              <w:left w:type="dxa" w:w="90"/>
-              <w:bottom w:type="dxa" w:w="60"/>
-              <w:right w:type="dxa" w:w="90"/>
-            </w:tcMar>
-            <w:vAlign w:val="center"/>
-          </w:tcPr>
-          <w:p>
-            <w:pPr>
-              <w:spacing w:after="20" w:line="252"/>
-              <w:jc w:val="left"/>
-            </w:pPr>
-            <w:r>
-              <w:rPr>
-                <w:sz w:val="17"/>
-                <w:szCs w:val="17"/>
-                <w:rFonts w:ascii="Consolas" w:cs="Consolas" w:eastAsia="Consolas" w:hAnsi="Consolas"/>
-              </w:rPr>
-              <w:t xml:space="preserve">STP_AD_PLANROL_DTPRE</w:t>
-            </w:r>
-          </w:p>
-        </w:tc>
-        <w:tc>
-          <w:tcPr>
-            <w:shd w:fill="EEF2F7" w:val="clear"/>
-            <w:tcMar>
-              <w:top w:type="dxa" w:w="60"/>
-              <w:left w:type="dxa" w:w="90"/>
-              <w:bottom w:type="dxa" w:w="60"/>
-              <w:right w:type="dxa" w:w="90"/>
-            </w:tcMar>
-            <w:vAlign w:val="center"/>
-          </w:tcPr>
-          <w:p>
-            <w:pPr>
-              <w:spacing w:after="20" w:line="252"/>
-              <w:jc w:val="left"/>
-            </w:pPr>
-            <w:r>
-              <w:rPr>
-                <w:b w:val="false"/>
-                <w:bCs w:val="false"/>
-                <w:color w:val="222222"/>
-                <w:sz w:val="19"/>
-                <w:szCs w:val="19"/>
-                <w:rFonts w:ascii="Arial" w:cs="Arial" w:eastAsia="Arial" w:hAnsi="Arial"/>
-              </w:rPr>
-              <w:t xml:space="preserve">Procedure</w:t>
-            </w:r>
-          </w:p>
-        </w:tc>
-        <w:tc>
-          <w:tcPr>
-            <w:shd w:fill="EEF2F7" w:val="clear"/>
-            <w:tcMar>
-              <w:top w:type="dxa" w:w="60"/>
-              <w:left w:type="dxa" w:w="90"/>
-              <w:bottom w:type="dxa" w:w="60"/>
-              <w:right w:type="dxa" w:w="90"/>
-            </w:tcMar>
-            <w:vAlign w:val="center"/>
-          </w:tcPr>
-          <w:p>
-            <w:pPr>
-              <w:spacing w:after="20" w:line="252"/>
-              <w:jc w:val="left"/>
-            </w:pPr>
-            <w:r>
-              <w:rPr>
-                <w:b w:val="false"/>
-                <w:bCs w:val="false"/>
-                <w:color w:val="222222"/>
-                <w:sz w:val="19"/>
-                <w:szCs w:val="19"/>
-                <w:rFonts w:ascii="Arial" w:cs="Arial" w:eastAsia="Arial" w:hAnsi="Arial"/>
-              </w:rPr>
-              <w:t xml:space="preserve">Botão "Definir Preparação" (Contratos → Planejamento → Rollout). Grava AD_PLANROL.DTPREPARA, registra evento 'DP' em AD_PLANELOG, dispara e-mails de apontamento e zera DATA_PREPARACAO_INTEGRADA quando a data muda (força reenvio — RN05).</w:t>
-            </w:r>
-          </w:p>
-        </w:tc>
-      </w:tr>
-      <w:tr>
-        <w:tc>
-          <w:tcPr>
-            <w:shd w:fill="FFFFFF" w:val="clear"/>
-            <w:tcMar>
-              <w:top w:type="dxa" w:w="60"/>
-              <w:left w:type="dxa" w:w="90"/>
-              <w:bottom w:type="dxa" w:w="60"/>
-              <w:right w:type="dxa" w:w="90"/>
-            </w:tcMar>
-            <w:vAlign w:val="center"/>
-          </w:tcPr>
-          <w:p>
-            <w:pPr>
-              <w:spacing w:after="20" w:line="252"/>
-              <w:jc w:val="left"/>
-            </w:pPr>
-            <w:r>
-              <w:rPr>
-                <w:b w:val="false"/>
-                <w:bCs w:val="false"/>
-                <w:color w:val="222222"/>
-                <w:sz w:val="19"/>
-                <w:szCs w:val="19"/>
-                <w:rFonts w:ascii="Arial" w:cs="Arial" w:eastAsia="Arial" w:hAnsi="Arial"/>
-              </w:rPr>
-              <w:t xml:space="preserve">3</w:t>
-            </w:r>
-          </w:p>
-        </w:tc>
-        <w:tc>
-          <w:tcPr>
-            <w:shd w:fill="FFFFFF" w:val="clear"/>
-            <w:tcMar>
-              <w:top w:type="dxa" w:w="60"/>
-              <w:left w:type="dxa" w:w="90"/>
-              <w:bottom w:type="dxa" w:w="60"/>
-              <w:right w:type="dxa" w:w="90"/>
-            </w:tcMar>
-            <w:vAlign w:val="center"/>
-          </w:tcPr>
-          <w:p>
-            <w:pPr>
-              <w:spacing w:after="20" w:line="252"/>
-              <w:jc w:val="left"/>
-            </w:pPr>
-            <w:r>
-              <w:rPr>
-                <w:sz w:val="17"/>
-                <w:szCs w:val="17"/>
-                <w:rFonts w:ascii="Consolas" w:cs="Consolas" w:eastAsia="Consolas" w:hAnsi="Consolas"/>
-              </w:rPr>
-              <w:t xml:space="preserve">VIEW_VOKE_ITSM_ATIVACAO_PEDIDO</w:t>
-            </w:r>
-          </w:p>
-        </w:tc>
-        <w:tc>
-          <w:tcPr>
-            <w:shd w:fill="FFFFFF" w:val="clear"/>
-            <w:tcMar>
-              <w:top w:type="dxa" w:w="60"/>
-              <w:left w:type="dxa" w:w="90"/>
-              <w:bottom w:type="dxa" w:w="60"/>
-              <w:right w:type="dxa" w:w="90"/>
-            </w:tcMar>
-            <w:vAlign w:val="center"/>
-          </w:tcPr>
-          <w:p>
-            <w:pPr>
-              <w:spacing w:after="20" w:line="252"/>
-              <w:jc w:val="left"/>
-            </w:pPr>
-            <w:r>
-              <w:rPr>
-                <w:b w:val="false"/>
-                <w:bCs w:val="false"/>
-                <w:color w:val="222222"/>
-                <w:sz w:val="19"/>
-                <w:szCs w:val="19"/>
-                <w:rFonts w:ascii="Arial" w:cs="Arial" w:eastAsia="Arial" w:hAnsi="Arial"/>
-              </w:rPr>
-              <w:t xml:space="preserve">View</w:t>
-            </w:r>
-          </w:p>
-        </w:tc>
-        <w:tc>
-          <w:tcPr>
-            <w:shd w:fill="FFFFFF" w:val="clear"/>
-            <w:tcMar>
-              <w:top w:type="dxa" w:w="60"/>
-              <w:left w:type="dxa" w:w="90"/>
-              <w:bottom w:type="dxa" w:w="60"/>
-              <w:right w:type="dxa" w:w="90"/>
-            </w:tcMar>
-            <w:vAlign w:val="center"/>
-          </w:tcPr>
-          <w:p>
-            <w:pPr>
-              <w:spacing w:after="20" w:line="252"/>
-              <w:jc w:val="left"/>
-            </w:pPr>
-            <w:r>
-              <w:rPr>
-                <w:b w:val="false"/>
-                <w:bCs w:val="false"/>
-                <w:color w:val="222222"/>
-                <w:sz w:val="19"/>
-                <w:szCs w:val="19"/>
-                <w:rFonts w:ascii="Arial" w:cs="Arial" w:eastAsia="Arial" w:hAnsi="Arial"/>
-              </w:rPr>
-              <w:t xml:space="preserve">Origem dos pedidos enviados ao Run2Biz na criação de chamados (consumida por PedidosController / ScheduleEnviarPedidosITSM). Passou a expor DT_PREPARACAO (origem AD_PLANROL.DTPREPARA) para o payload do chamado.</w:t>
-            </w:r>
-          </w:p>
-        </w:tc>
-      </w:tr>
-      <w:tr>
-        <w:tc>
-          <w:tcPr>
-            <w:shd w:fill="EEF2F7" w:val="clear"/>
-            <w:tcMar>
-              <w:top w:type="dxa" w:w="60"/>
-              <w:left w:type="dxa" w:w="90"/>
-              <w:bottom w:type="dxa" w:w="60"/>
-              <w:right w:type="dxa" w:w="90"/>
-            </w:tcMar>
-            <w:vAlign w:val="center"/>
-          </w:tcPr>
-          <w:p>
-            <w:pPr>
-              <w:spacing w:after="20" w:line="252"/>
-              <w:jc w:val="left"/>
-            </w:pPr>
-            <w:r>
-              <w:rPr>
-                <w:b w:val="false"/>
-                <w:bCs w:val="false"/>
-                <w:color w:val="222222"/>
-                <w:sz w:val="19"/>
-                <w:szCs w:val="19"/>
-                <w:rFonts w:ascii="Arial" w:cs="Arial" w:eastAsia="Arial" w:hAnsi="Arial"/>
-              </w:rPr>
-              <w:t xml:space="preserve">4</w:t>
-            </w:r>
-          </w:p>
-        </w:tc>
-        <w:tc>
-          <w:tcPr>
-            <w:shd w:fill="EEF2F7" w:val="clear"/>
-            <w:tcMar>
-              <w:top w:type="dxa" w:w="60"/>
-              <w:left w:type="dxa" w:w="90"/>
-              <w:bottom w:type="dxa" w:w="60"/>
-              <w:right w:type="dxa" w:w="90"/>
-            </w:tcMar>
-            <w:vAlign w:val="center"/>
-          </w:tcPr>
-          <w:p>
-            <w:pPr>
-              <w:spacing w:after="20" w:line="252"/>
-              <w:jc w:val="left"/>
-            </w:pPr>
-            <w:r>
-              <w:rPr>
-                <w:sz w:val="17"/>
-                <w:szCs w:val="17"/>
-                <w:rFonts w:ascii="Consolas" w:cs="Consolas" w:eastAsia="Consolas" w:hAnsi="Consolas"/>
-              </w:rPr>
-              <w:t xml:space="preserve">AD_TGFINTE.STATUSPICKING → opção EX</w:t>
-            </w:r>
-          </w:p>
-        </w:tc>
-        <w:tc>
-          <w:tcPr>
-            <w:shd w:fill="EEF2F7" w:val="clear"/>
-            <w:tcMar>
-              <w:top w:type="dxa" w:w="60"/>
-              <w:left w:type="dxa" w:w="90"/>
-              <w:bottom w:type="dxa" w:w="60"/>
-              <w:right w:type="dxa" w:w="90"/>
-            </w:tcMar>
-            <w:vAlign w:val="center"/>
-          </w:tcPr>
-          <w:p>
-            <w:pPr>
-              <w:spacing w:after="20" w:line="252"/>
-              <w:jc w:val="left"/>
-            </w:pPr>
-            <w:r>
-              <w:rPr>
-                <w:b w:val="false"/>
-                <w:bCs w:val="false"/>
-                <w:color w:val="222222"/>
-                <w:sz w:val="19"/>
-                <w:szCs w:val="19"/>
-                <w:rFonts w:ascii="Arial" w:cs="Arial" w:eastAsia="Arial" w:hAnsi="Arial"/>
-              </w:rPr>
-              <w:t xml:space="preserve">Opção de domínio (TDDOPC)</w:t>
-            </w:r>
-          </w:p>
-        </w:tc>
-        <w:tc>
-          <w:tcPr>
-            <w:shd w:fill="EEF2F7" w:val="clear"/>
-            <w:tcMar>
-              <w:top w:type="dxa" w:w="60"/>
-              <w:left w:type="dxa" w:w="90"/>
-              <w:bottom w:type="dxa" w:w="60"/>
-              <w:right w:type="dxa" w:w="90"/>
-            </w:tcMar>
-            <w:vAlign w:val="center"/>
-          </w:tcPr>
-          <w:p>
-            <w:pPr>
-              <w:spacing w:after="20" w:line="252"/>
-              <w:jc w:val="left"/>
-            </w:pPr>
-            <w:r>
-              <w:rPr>
-                <w:b w:val="false"/>
-                <w:bCs w:val="false"/>
-                <w:color w:val="222222"/>
-                <w:sz w:val="19"/>
-                <w:szCs w:val="19"/>
-                <w:rFonts w:ascii="Arial" w:cs="Arial" w:eastAsia="Arial" w:hAnsi="Arial"/>
-              </w:rPr>
-              <w:t xml:space="preserve">Cadastra o valor EX = 'Expedição' (ordem 8, após NE). Sem ele, o 'EX' gravado pelo ScheduleEnviarDadosNota apareceria em branco/inválido no Gerenciamento Integração. Script idempotente: DOMINIO_STATUSPICKING_EX.sql</w:t>
+              <w:t xml:space="preserve">Cadastra o valor EX = 'Expedição' (ordem 8, após NE). Sem ele, o 'EX' gravado pelo ScheduleEnviarDadosNota (guarda NE → EX) apareceria em branco/inválido na tela Gerenciamento Integração. Script idempotente: DOMINIO_STATUSPICKING_EX.sql</w:t>
             </w:r>
           </w:p>
         </w:tc>
@@ -2986,16 +2643,16 @@
           <w:szCs w:val="19"/>
           <w:rFonts w:ascii="Consolas" w:cs="Consolas" w:eastAsia="Consolas" w:hAnsi="Consolas"/>
         </w:rPr>
-        <w:t xml:space="preserve">AD_PLANROL</w:t>
-      </w:r>
-      <w:r>
-        <w:rPr>
-          <w:color w:val="222222"/>
-          <w:sz w:val="21"/>
-          <w:szCs w:val="21"/>
-          <w:rFonts w:ascii="Arial" w:cs="Arial" w:eastAsia="Arial" w:hAnsi="Arial"/>
-        </w:rPr>
-        <w:t xml:space="preserve"> (coluna nova + </w:t>
+        <w:t xml:space="preserve">TDDCAM</w:t>
+      </w:r>
+      <w:r>
+        <w:rPr>
+          <w:color w:val="222222"/>
+          <w:sz w:val="21"/>
+          <w:szCs w:val="21"/>
+          <w:rFonts w:ascii="Arial" w:cs="Arial" w:eastAsia="Arial" w:hAnsi="Arial"/>
+        </w:rPr>
+        <w:t xml:space="preserve"> / </w:t>
       </w:r>
       <w:r>
         <w:rPr>
@@ -3004,16 +2661,16 @@
           <w:szCs w:val="19"/>
           <w:rFonts w:ascii="Consolas" w:cs="Consolas" w:eastAsia="Consolas" w:hAnsi="Consolas"/>
         </w:rPr>
-        <w:t xml:space="preserve">DTPREPARA</w:t>
-      </w:r>
-      <w:r>
-        <w:rPr>
-          <w:color w:val="222222"/>
-          <w:sz w:val="21"/>
-          <w:szCs w:val="21"/>
-          <w:rFonts w:ascii="Arial" w:cs="Arial" w:eastAsia="Arial" w:hAnsi="Arial"/>
-        </w:rPr>
-        <w:t xml:space="preserve">), </w:t>
+        <w:t xml:space="preserve">TDDOPC</w:t>
+      </w:r>
+      <w:r>
+        <w:rPr>
+          <w:color w:val="222222"/>
+          <w:sz w:val="21"/>
+          <w:szCs w:val="21"/>
+          <w:rFonts w:ascii="Arial" w:cs="Arial" w:eastAsia="Arial" w:hAnsi="Arial"/>
+        </w:rPr>
+        <w:t xml:space="preserve"> (cadastro da opção de domínio do campo </w:t>
       </w:r>
       <w:r>
         <w:rPr>
@@ -3022,88 +2679,16 @@
           <w:szCs w:val="19"/>
           <w:rFonts w:ascii="Consolas" w:cs="Consolas" w:eastAsia="Consolas" w:hAnsi="Consolas"/>
         </w:rPr>
-        <w:t xml:space="preserve">AD_PLANELOG</w:t>
-      </w:r>
-      <w:r>
-        <w:rPr>
-          <w:color w:val="222222"/>
-          <w:sz w:val="21"/>
-          <w:szCs w:val="21"/>
-          <w:rFonts w:ascii="Arial" w:cs="Arial" w:eastAsia="Arial" w:hAnsi="Arial"/>
-        </w:rPr>
-        <w:t xml:space="preserve"> (log do evento DP), </w:t>
-      </w:r>
-      <w:r>
-        <w:rPr>
-          <w:color w:val="1A1A1A"/>
-          <w:sz w:val="19"/>
-          <w:szCs w:val="19"/>
-          <w:rFonts w:ascii="Consolas" w:cs="Consolas" w:eastAsia="Consolas" w:hAnsi="Consolas"/>
-        </w:rPr>
-        <w:t xml:space="preserve">TDDCAM</w:t>
-      </w:r>
-      <w:r>
-        <w:rPr>
-          <w:color w:val="222222"/>
-          <w:sz w:val="21"/>
-          <w:szCs w:val="21"/>
-          <w:rFonts w:ascii="Arial" w:cs="Arial" w:eastAsia="Arial" w:hAnsi="Arial"/>
-        </w:rPr>
-        <w:t xml:space="preserve">/</w:t>
-      </w:r>
-      <w:r>
-        <w:rPr>
-          <w:color w:val="1A1A1A"/>
-          <w:sz w:val="19"/>
-          <w:szCs w:val="19"/>
-          <w:rFonts w:ascii="Consolas" w:cs="Consolas" w:eastAsia="Consolas" w:hAnsi="Consolas"/>
-        </w:rPr>
-        <w:t xml:space="preserve">TDDOPC</w:t>
-      </w:r>
-      <w:r>
-        <w:rPr>
-          <w:color w:val="222222"/>
-          <w:sz w:val="21"/>
-          <w:szCs w:val="21"/>
-          <w:rFonts w:ascii="Arial" w:cs="Arial" w:eastAsia="Arial" w:hAnsi="Arial"/>
-        </w:rPr>
-        <w:t xml:space="preserve"> (domínio), e a view sobre </w:t>
-      </w:r>
-      <w:r>
-        <w:rPr>
-          <w:color w:val="1A1A1A"/>
-          <w:sz w:val="19"/>
-          <w:szCs w:val="19"/>
-          <w:rFonts w:ascii="Consolas" w:cs="Consolas" w:eastAsia="Consolas" w:hAnsi="Consolas"/>
-        </w:rPr>
-        <w:t xml:space="preserve">TGFCAB</w:t>
-      </w:r>
-      <w:r>
-        <w:rPr>
-          <w:color w:val="222222"/>
-          <w:sz w:val="21"/>
-          <w:szCs w:val="21"/>
-          <w:rFonts w:ascii="Arial" w:cs="Arial" w:eastAsia="Arial" w:hAnsi="Arial"/>
-        </w:rPr>
-        <w:t xml:space="preserve"> / </w:t>
-      </w:r>
-      <w:r>
-        <w:rPr>
-          <w:color w:val="1A1A1A"/>
-          <w:sz w:val="19"/>
-          <w:szCs w:val="19"/>
-          <w:rFonts w:ascii="Consolas" w:cs="Consolas" w:eastAsia="Consolas" w:hAnsi="Consolas"/>
-        </w:rPr>
-        <w:t xml:space="preserve">AD_TGFINTE</w:t>
-      </w:r>
-      <w:r>
-        <w:rPr>
-          <w:color w:val="222222"/>
-          <w:sz w:val="21"/>
-          <w:szCs w:val="21"/>
-          <w:rFonts w:ascii="Arial" w:cs="Arial" w:eastAsia="Arial" w:hAnsi="Arial"/>
-        </w:rPr>
-        <w:t xml:space="preserve">.</w:t>
+        <w:t xml:space="preserve">AD_TGFINTE.STATUSPICKING</w:t>
+      </w:r>
+      <w:r>
+        <w:rPr>
+          <w:color w:val="222222"/>
+          <w:sz w:val="21"/>
+          <w:szCs w:val="21"/>
+          <w:rFonts w:ascii="Arial" w:cs="Arial" w:eastAsia="Arial" w:hAnsi="Arial"/>
+        </w:rPr>
+        <w:t xml:space="preserve">).</w:t>
       </w:r>
     </w:p>
     <w:p>
@@ -3136,7 +2721,43 @@
           <w:szCs w:val="21"/>
           <w:rFonts w:ascii="Arial" w:cs="Arial" w:eastAsia="Arial" w:hAnsi="Arial"/>
         </w:rPr>
-        <w:t xml:space="preserve">Ações agendadas ativas do módulo 52 após a subida (Tipo de ação: Java):</w:t>
+        <w:t xml:space="preserve">Ações agendadas ativas do módulo 52 após a subida (Tipo de ação: Java). A gravação do estado </w:t>
+      </w:r>
+      <w:r>
+        <w:rPr>
+          <w:color w:val="1A1A1A"/>
+          <w:sz w:val="19"/>
+          <w:szCs w:val="19"/>
+          <w:rFonts w:ascii="Consolas" w:cs="Consolas" w:eastAsia="Consolas" w:hAnsi="Consolas"/>
+        </w:rPr>
+        <w:t xml:space="preserve">EX</w:t>
+      </w:r>
+      <w:r>
+        <w:rPr>
+          <w:color w:val="222222"/>
+          <w:sz w:val="21"/>
+          <w:szCs w:val="21"/>
+          <w:rFonts w:ascii="Arial" w:cs="Arial" w:eastAsia="Arial" w:hAnsi="Arial"/>
+        </w:rPr>
+        <w:t xml:space="preserve"> ocorre na </w:t>
+      </w:r>
+      <w:r>
+        <w:rPr>
+          <w:color w:val="1A1A1A"/>
+          <w:sz w:val="19"/>
+          <w:szCs w:val="19"/>
+          <w:rFonts w:ascii="Consolas" w:cs="Consolas" w:eastAsia="Consolas" w:hAnsi="Consolas"/>
+        </w:rPr>
+        <w:t xml:space="preserve">ScheduleEnviarDadosNota</w:t>
+      </w:r>
+      <w:r>
+        <w:rPr>
+          <w:color w:val="222222"/>
+          <w:sz w:val="21"/>
+          <w:szCs w:val="21"/>
+          <w:rFonts w:ascii="Arial" w:cs="Arial" w:eastAsia="Arial" w:hAnsi="Arial"/>
+        </w:rPr>
+        <w:t xml:space="preserve"> (nº 176):</w:t>
       </w:r>
     </w:p>
     <w:tbl>
@@ -4026,38 +3647,6 @@
     <w:p>
       <w:pPr>
         <w:pBdr>
-          <w:top w:val="single" w:color="E0C060" w:sz="4"/>
-          <w:bottom w:val="single" w:color="E0C060" w:sz="4"/>
-          <w:left w:val="single" w:color="E0A020" w:sz="18"/>
-          <w:right w:val="single" w:color="E0C060" w:sz="4"/>
-        </w:pBdr>
-        <w:shd w:fill="FFF6DB" w:val="clear"/>
-        <w:spacing w:before="100" w:after="120"/>
-      </w:pPr>
-      <w:r>
-        <w:rPr>
-          <w:b/>
-          <w:bCs/>
-          <w:color w:val="8A6D00"/>
-          <w:sz w:val="19"/>
-          <w:szCs w:val="19"/>
-          <w:rFonts w:ascii="Arial" w:cs="Arial" w:eastAsia="Arial" w:hAnsi="Arial"/>
-        </w:rPr>
-        <w:t xml:space="preserve">⚠ Ponto de atenção — Cenário B (Data de Preparação pós-criação): </w:t>
-      </w:r>
-      <w:r>
-        <w:rPr>
-          <w:color w:val="5C4A00"/>
-          <w:sz w:val="19"/>
-          <w:szCs w:val="19"/>
-          <w:rFonts w:ascii="Arial" w:cs="Arial" w:eastAsia="Arial" w:hAnsi="Arial"/>
-        </w:rPr>
-        <w:t xml:space="preserve">a rotina dedicada ScheduleEnviarPreparacaoITSM não aparece entre as ações agendadas evidenciadas. Confirmar se foi cadastrada como Ação Agendada do módulo 52 (mesmo intervalo das demais) — sem ela, a atualização da Data de Preparação em chamados já criados não é disparada.</w:t>
-      </w:r>
-    </w:p>
-    <w:p>
-      <w:pPr>
-        <w:pBdr>
           <w:bottom w:val="single" w:color="F291D6" w:sz="12" w:space="4"/>
         </w:pBdr>
         <w:spacing w:before="320" w:after="140"/>
@@ -4071,586 +3660,7 @@
           <w:szCs w:val="30"/>
           <w:rFonts w:ascii="Arial" w:cs="Arial" w:eastAsia="Arial" w:hAnsi="Arial"/>
         </w:rPr>
-        <w:t xml:space="preserve">7. Regras de negócio atendidas</w:t>
-      </w:r>
-    </w:p>
-    <w:tbl>
-      <w:tblPr>
-        <w:tblW w:type="pct" w:w="100%"/>
-        <w:tblBorders>
-          <w:top w:val="single" w:color="C9D2DE" w:sz="4"/>
-          <w:left w:val="single" w:color="C9D2DE" w:sz="4"/>
-          <w:bottom w:val="single" w:color="C9D2DE" w:sz="4"/>
-          <w:right w:val="single" w:color="C9D2DE" w:sz="4"/>
-          <w:insideH w:val="single" w:color="C9D2DE" w:sz="4"/>
-          <w:insideV w:val="single" w:color="C9D2DE" w:sz="4"/>
-        </w:tblBorders>
-      </w:tblPr>
-      <w:tblGrid>
-        <w:gridCol w:w="960"/>
-        <w:gridCol w:w="8640"/>
-      </w:tblGrid>
-      <w:tr>
-        <w:trPr>
-          <w:tblHeader/>
-        </w:trPr>
-        <w:tc>
-          <w:tcPr>
-            <w:shd w:fill="1B3D6D" w:val="clear"/>
-            <w:tcMar>
-              <w:top w:type="dxa" w:w="60"/>
-              <w:left w:type="dxa" w:w="90"/>
-              <w:bottom w:type="dxa" w:w="60"/>
-              <w:right w:type="dxa" w:w="90"/>
-            </w:tcMar>
-            <w:vAlign w:val="center"/>
-          </w:tcPr>
-          <w:p>
-            <w:pPr>
-              <w:spacing w:after="20" w:line="252"/>
-              <w:jc w:val="left"/>
-            </w:pPr>
-            <w:r>
-              <w:rPr>
-                <w:b/>
-                <w:bCs/>
-                <w:color w:val="FFFFFF"/>
-                <w:sz w:val="19"/>
-                <w:szCs w:val="19"/>
-                <w:rFonts w:ascii="Arial" w:cs="Arial" w:eastAsia="Arial" w:hAnsi="Arial"/>
-              </w:rPr>
-              <w:t xml:space="preserve">RN</w:t>
-            </w:r>
-          </w:p>
-        </w:tc>
-        <w:tc>
-          <w:tcPr>
-            <w:shd w:fill="1B3D6D" w:val="clear"/>
-            <w:tcMar>
-              <w:top w:type="dxa" w:w="60"/>
-              <w:left w:type="dxa" w:w="90"/>
-              <w:bottom w:type="dxa" w:w="60"/>
-              <w:right w:type="dxa" w:w="90"/>
-            </w:tcMar>
-            <w:vAlign w:val="center"/>
-          </w:tcPr>
-          <w:p>
-            <w:pPr>
-              <w:spacing w:after="20" w:line="252"/>
-              <w:jc w:val="left"/>
-            </w:pPr>
-            <w:r>
-              <w:rPr>
-                <w:b/>
-                <w:bCs/>
-                <w:color w:val="FFFFFF"/>
-                <w:sz w:val="19"/>
-                <w:szCs w:val="19"/>
-                <w:rFonts w:ascii="Arial" w:cs="Arial" w:eastAsia="Arial" w:hAnsi="Arial"/>
-              </w:rPr>
-              <w:t xml:space="preserve">Descrição</w:t>
-            </w:r>
-          </w:p>
-        </w:tc>
-      </w:tr>
-      <w:tr>
-        <w:tc>
-          <w:tcPr>
-            <w:shd w:fill="FFFFFF" w:val="clear"/>
-            <w:tcMar>
-              <w:top w:type="dxa" w:w="60"/>
-              <w:left w:type="dxa" w:w="90"/>
-              <w:bottom w:type="dxa" w:w="60"/>
-              <w:right w:type="dxa" w:w="90"/>
-            </w:tcMar>
-            <w:vAlign w:val="center"/>
-          </w:tcPr>
-          <w:p>
-            <w:pPr>
-              <w:spacing w:after="20" w:line="252"/>
-              <w:jc w:val="left"/>
-            </w:pPr>
-            <w:r>
-              <w:rPr>
-                <w:b w:val="false"/>
-                <w:bCs w:val="false"/>
-                <w:color w:val="222222"/>
-                <w:sz w:val="19"/>
-                <w:szCs w:val="19"/>
-                <w:rFonts w:ascii="Arial" w:cs="Arial" w:eastAsia="Arial" w:hAnsi="Arial"/>
-              </w:rPr>
-              <w:t xml:space="preserve">RN01</w:t>
-            </w:r>
-          </w:p>
-        </w:tc>
-        <w:tc>
-          <w:tcPr>
-            <w:shd w:fill="FFFFFF" w:val="clear"/>
-            <w:tcMar>
-              <w:top w:type="dxa" w:w="60"/>
-              <w:left w:type="dxa" w:w="90"/>
-              <w:bottom w:type="dxa" w:w="60"/>
-              <w:right w:type="dxa" w:w="90"/>
-            </w:tcMar>
-            <w:vAlign w:val="center"/>
-          </w:tcPr>
-          <w:p>
-            <w:pPr>
-              <w:spacing w:after="20" w:line="252"/>
-              <w:jc w:val="left"/>
-            </w:pPr>
-            <w:r>
-              <w:rPr>
-                <w:b w:val="false"/>
-                <w:bCs w:val="false"/>
-                <w:color w:val="222222"/>
-                <w:sz w:val="19"/>
-                <w:szCs w:val="19"/>
-                <w:rFonts w:ascii="Arial" w:cs="Arial" w:eastAsia="Arial" w:hAnsi="Arial"/>
-              </w:rPr>
-              <w:t xml:space="preserve">Origem: a Data de Preparação vem do Pedido de Venda (AD_PLANROL.DTPREPARA), exposta pela view como DT_PREPARACAO.</w:t>
-            </w:r>
-          </w:p>
-        </w:tc>
-      </w:tr>
-      <w:tr>
-        <w:tc>
-          <w:tcPr>
-            <w:shd w:fill="EEF2F7" w:val="clear"/>
-            <w:tcMar>
-              <w:top w:type="dxa" w:w="60"/>
-              <w:left w:type="dxa" w:w="90"/>
-              <w:bottom w:type="dxa" w:w="60"/>
-              <w:right w:type="dxa" w:w="90"/>
-            </w:tcMar>
-            <w:vAlign w:val="center"/>
-          </w:tcPr>
-          <w:p>
-            <w:pPr>
-              <w:spacing w:after="20" w:line="252"/>
-              <w:jc w:val="left"/>
-            </w:pPr>
-            <w:r>
-              <w:rPr>
-                <w:b w:val="false"/>
-                <w:bCs w:val="false"/>
-                <w:color w:val="222222"/>
-                <w:sz w:val="19"/>
-                <w:szCs w:val="19"/>
-                <w:rFonts w:ascii="Arial" w:cs="Arial" w:eastAsia="Arial" w:hAnsi="Arial"/>
-              </w:rPr>
-              <w:t xml:space="preserve">RN02</w:t>
-            </w:r>
-          </w:p>
-        </w:tc>
-        <w:tc>
-          <w:tcPr>
-            <w:shd w:fill="EEF2F7" w:val="clear"/>
-            <w:tcMar>
-              <w:top w:type="dxa" w:w="60"/>
-              <w:left w:type="dxa" w:w="90"/>
-              <w:bottom w:type="dxa" w:w="60"/>
-              <w:right w:type="dxa" w:w="90"/>
-            </w:tcMar>
-            <w:vAlign w:val="center"/>
-          </w:tcPr>
-          <w:p>
-            <w:pPr>
-              <w:spacing w:after="20" w:line="252"/>
-              <w:jc w:val="left"/>
-            </w:pPr>
-            <w:r>
-              <w:rPr>
-                <w:b w:val="false"/>
-                <w:bCs w:val="false"/>
-                <w:color w:val="222222"/>
-                <w:sz w:val="19"/>
-                <w:szCs w:val="19"/>
-                <w:rFonts w:ascii="Arial" w:cs="Arial" w:eastAsia="Arial" w:hAnsi="Arial"/>
-              </w:rPr>
-              <w:t xml:space="preserve">Envio: a data é adicionada ao payload de criação do chamado.</w:t>
-            </w:r>
-          </w:p>
-        </w:tc>
-      </w:tr>
-      <w:tr>
-        <w:tc>
-          <w:tcPr>
-            <w:shd w:fill="FFFFFF" w:val="clear"/>
-            <w:tcMar>
-              <w:top w:type="dxa" w:w="60"/>
-              <w:left w:type="dxa" w:w="90"/>
-              <w:bottom w:type="dxa" w:w="60"/>
-              <w:right w:type="dxa" w:w="90"/>
-            </w:tcMar>
-            <w:vAlign w:val="center"/>
-          </w:tcPr>
-          <w:p>
-            <w:pPr>
-              <w:spacing w:after="20" w:line="252"/>
-              <w:jc w:val="left"/>
-            </w:pPr>
-            <w:r>
-              <w:rPr>
-                <w:b w:val="false"/>
-                <w:bCs w:val="false"/>
-                <w:color w:val="222222"/>
-                <w:sz w:val="19"/>
-                <w:szCs w:val="19"/>
-                <w:rFonts w:ascii="Arial" w:cs="Arial" w:eastAsia="Arial" w:hAnsi="Arial"/>
-              </w:rPr>
-              <w:t xml:space="preserve">RN03</w:t>
-            </w:r>
-          </w:p>
-        </w:tc>
-        <w:tc>
-          <w:tcPr>
-            <w:shd w:fill="FFFFFF" w:val="clear"/>
-            <w:tcMar>
-              <w:top w:type="dxa" w:w="60"/>
-              <w:left w:type="dxa" w:w="90"/>
-              <w:bottom w:type="dxa" w:w="60"/>
-              <w:right w:type="dxa" w:w="90"/>
-            </w:tcMar>
-            <w:vAlign w:val="center"/>
-          </w:tcPr>
-          <w:p>
-            <w:pPr>
-              <w:spacing w:after="20" w:line="252"/>
-              <w:jc w:val="left"/>
-            </w:pPr>
-            <w:r>
-              <w:rPr>
-                <w:b w:val="false"/>
-                <w:bCs w:val="false"/>
-                <w:color w:val="222222"/>
-                <w:sz w:val="19"/>
-                <w:szCs w:val="19"/>
-                <w:rFonts w:ascii="Arial" w:cs="Arial" w:eastAsia="Arial" w:hAnsi="Arial"/>
-              </w:rPr>
-              <w:t xml:space="preserve">Estrutura: campo data_preparacao, tipo Data, formato yyyy-MM-dd.</w:t>
-            </w:r>
-          </w:p>
-        </w:tc>
-      </w:tr>
-      <w:tr>
-        <w:tc>
-          <w:tcPr>
-            <w:shd w:fill="EEF2F7" w:val="clear"/>
-            <w:tcMar>
-              <w:top w:type="dxa" w:w="60"/>
-              <w:left w:type="dxa" w:w="90"/>
-              <w:bottom w:type="dxa" w:w="60"/>
-              <w:right w:type="dxa" w:w="90"/>
-            </w:tcMar>
-            <w:vAlign w:val="center"/>
-          </w:tcPr>
-          <w:p>
-            <w:pPr>
-              <w:spacing w:after="20" w:line="252"/>
-              <w:jc w:val="left"/>
-            </w:pPr>
-            <w:r>
-              <w:rPr>
-                <w:b w:val="false"/>
-                <w:bCs w:val="false"/>
-                <w:color w:val="222222"/>
-                <w:sz w:val="19"/>
-                <w:szCs w:val="19"/>
-                <w:rFonts w:ascii="Arial" w:cs="Arial" w:eastAsia="Arial" w:hAnsi="Arial"/>
-              </w:rPr>
-              <w:t xml:space="preserve">RN04</w:t>
-            </w:r>
-          </w:p>
-        </w:tc>
-        <w:tc>
-          <w:tcPr>
-            <w:shd w:fill="EEF2F7" w:val="clear"/>
-            <w:tcMar>
-              <w:top w:type="dxa" w:w="60"/>
-              <w:left w:type="dxa" w:w="90"/>
-              <w:bottom w:type="dxa" w:w="60"/>
-              <w:right w:type="dxa" w:w="90"/>
-            </w:tcMar>
-            <w:vAlign w:val="center"/>
-          </w:tcPr>
-          <w:p>
-            <w:pPr>
-              <w:spacing w:after="20" w:line="252"/>
-              <w:jc w:val="left"/>
-            </w:pPr>
-            <w:r>
-              <w:rPr>
-                <w:b w:val="false"/>
-                <w:bCs w:val="false"/>
-                <w:color w:val="222222"/>
-                <w:sz w:val="19"/>
-                <w:szCs w:val="19"/>
-                <w:rFonts w:ascii="Arial" w:cs="Arial" w:eastAsia="Arial" w:hAnsi="Arial"/>
-              </w:rPr>
-              <w:t xml:space="preserve">Disponibilidade: enviada sempre que existir; quando nula, a chave é omitida (não envia string vazia).</w:t>
-            </w:r>
-          </w:p>
-        </w:tc>
-      </w:tr>
-      <w:tr>
-        <w:tc>
-          <w:tcPr>
-            <w:shd w:fill="FFFFFF" w:val="clear"/>
-            <w:tcMar>
-              <w:top w:type="dxa" w:w="60"/>
-              <w:left w:type="dxa" w:w="90"/>
-              <w:bottom w:type="dxa" w:w="60"/>
-              <w:right w:type="dxa" w:w="90"/>
-            </w:tcMar>
-            <w:vAlign w:val="center"/>
-          </w:tcPr>
-          <w:p>
-            <w:pPr>
-              <w:spacing w:after="20" w:line="252"/>
-              <w:jc w:val="left"/>
-            </w:pPr>
-            <w:r>
-              <w:rPr>
-                <w:b w:val="false"/>
-                <w:bCs w:val="false"/>
-                <w:color w:val="222222"/>
-                <w:sz w:val="19"/>
-                <w:szCs w:val="19"/>
-                <w:rFonts w:ascii="Arial" w:cs="Arial" w:eastAsia="Arial" w:hAnsi="Arial"/>
-              </w:rPr>
-              <w:t xml:space="preserve">RN05</w:t>
-            </w:r>
-          </w:p>
-        </w:tc>
-        <w:tc>
-          <w:tcPr>
-            <w:shd w:fill="FFFFFF" w:val="clear"/>
-            <w:tcMar>
-              <w:top w:type="dxa" w:w="60"/>
-              <w:left w:type="dxa" w:w="90"/>
-              <w:bottom w:type="dxa" w:w="60"/>
-              <w:right w:type="dxa" w:w="90"/>
-            </w:tcMar>
-            <w:vAlign w:val="center"/>
-          </w:tcPr>
-          <w:p>
-            <w:pPr>
-              <w:spacing w:after="20" w:line="252"/>
-              <w:jc w:val="left"/>
-            </w:pPr>
-            <w:r>
-              <w:rPr>
-                <w:b w:val="false"/>
-                <w:bCs w:val="false"/>
-                <w:color w:val="222222"/>
-                <w:sz w:val="19"/>
-                <w:szCs w:val="19"/>
-                <w:rFonts w:ascii="Arial" w:cs="Arial" w:eastAsia="Arial" w:hAnsi="Arial"/>
-              </w:rPr>
-              <w:t xml:space="preserve">Atualização: a cada ciclo o valor atual é lido e enviado; ao (re)gravar a data, DATA_PREPARACAO_INTEGRADA é zerada para forçar reenvio.</w:t>
-            </w:r>
-          </w:p>
-        </w:tc>
-      </w:tr>
-      <w:tr>
-        <w:tc>
-          <w:tcPr>
-            <w:shd w:fill="EEF2F7" w:val="clear"/>
-            <w:tcMar>
-              <w:top w:type="dxa" w:w="60"/>
-              <w:left w:type="dxa" w:w="90"/>
-              <w:bottom w:type="dxa" w:w="60"/>
-              <w:right w:type="dxa" w:w="90"/>
-            </w:tcMar>
-            <w:vAlign w:val="center"/>
-          </w:tcPr>
-          <w:p>
-            <w:pPr>
-              <w:spacing w:after="20" w:line="252"/>
-              <w:jc w:val="left"/>
-            </w:pPr>
-            <w:r>
-              <w:rPr>
-                <w:b w:val="false"/>
-                <w:bCs w:val="false"/>
-                <w:color w:val="222222"/>
-                <w:sz w:val="19"/>
-                <w:szCs w:val="19"/>
-                <w:rFonts w:ascii="Arial" w:cs="Arial" w:eastAsia="Arial" w:hAnsi="Arial"/>
-              </w:rPr>
-              <w:t xml:space="preserve">RN06</w:t>
-            </w:r>
-          </w:p>
-        </w:tc>
-        <w:tc>
-          <w:tcPr>
-            <w:shd w:fill="EEF2F7" w:val="clear"/>
-            <w:tcMar>
-              <w:top w:type="dxa" w:w="60"/>
-              <w:left w:type="dxa" w:w="90"/>
-              <w:bottom w:type="dxa" w:w="60"/>
-              <w:right w:type="dxa" w:w="90"/>
-            </w:tcMar>
-            <w:vAlign w:val="center"/>
-          </w:tcPr>
-          <w:p>
-            <w:pPr>
-              <w:spacing w:after="20" w:line="252"/>
-              <w:jc w:val="left"/>
-            </w:pPr>
-            <w:r>
-              <w:rPr>
-                <w:b w:val="false"/>
-                <w:bCs w:val="false"/>
-                <w:color w:val="222222"/>
-                <w:sz w:val="19"/>
-                <w:szCs w:val="19"/>
-                <w:rFonts w:ascii="Arial" w:cs="Arial" w:eastAsia="Arial" w:hAnsi="Arial"/>
-              </w:rPr>
-              <w:t xml:space="preserve">Mecanismo oficial: reaproveita o schedule/controller de envio de pedidos (identificação do chamado por NUNOTA).</w:t>
-            </w:r>
-          </w:p>
-        </w:tc>
-      </w:tr>
-      <w:tr>
-        <w:tc>
-          <w:tcPr>
-            <w:shd w:fill="FFFFFF" w:val="clear"/>
-            <w:tcMar>
-              <w:top w:type="dxa" w:w="60"/>
-              <w:left w:type="dxa" w:w="90"/>
-              <w:bottom w:type="dxa" w:w="60"/>
-              <w:right w:type="dxa" w:w="90"/>
-            </w:tcMar>
-            <w:vAlign w:val="center"/>
-          </w:tcPr>
-          <w:p>
-            <w:pPr>
-              <w:spacing w:after="20" w:line="252"/>
-              <w:jc w:val="left"/>
-            </w:pPr>
-            <w:r>
-              <w:rPr>
-                <w:b w:val="false"/>
-                <w:bCs w:val="false"/>
-                <w:color w:val="222222"/>
-                <w:sz w:val="19"/>
-                <w:szCs w:val="19"/>
-                <w:rFonts w:ascii="Arial" w:cs="Arial" w:eastAsia="Arial" w:hAnsi="Arial"/>
-              </w:rPr>
-              <w:t xml:space="preserve">RN07</w:t>
-            </w:r>
-          </w:p>
-        </w:tc>
-        <w:tc>
-          <w:tcPr>
-            <w:shd w:fill="FFFFFF" w:val="clear"/>
-            <w:tcMar>
-              <w:top w:type="dxa" w:w="60"/>
-              <w:left w:type="dxa" w:w="90"/>
-              <w:bottom w:type="dxa" w:w="60"/>
-              <w:right w:type="dxa" w:w="90"/>
-            </w:tcMar>
-            <w:vAlign w:val="center"/>
-          </w:tcPr>
-          <w:p>
-            <w:pPr>
-              <w:spacing w:after="20" w:line="252"/>
-              <w:jc w:val="left"/>
-            </w:pPr>
-            <w:r>
-              <w:rPr>
-                <w:b w:val="false"/>
-                <w:bCs w:val="false"/>
-                <w:color w:val="222222"/>
-                <w:sz w:val="19"/>
-                <w:szCs w:val="19"/>
-                <w:rFonts w:ascii="Arial" w:cs="Arial" w:eastAsia="Arial" w:hAnsi="Arial"/>
-              </w:rPr>
-              <w:t xml:space="preserve">Compatibilidade: o campo data_preparacao fica disponível no payload para o VokeNext popular o campo correspondente.</w:t>
-            </w:r>
-          </w:p>
-        </w:tc>
-      </w:tr>
-      <w:tr>
-        <w:tc>
-          <w:tcPr>
-            <w:shd w:fill="EEF2F7" w:val="clear"/>
-            <w:tcMar>
-              <w:top w:type="dxa" w:w="60"/>
-              <w:left w:type="dxa" w:w="90"/>
-              <w:bottom w:type="dxa" w:w="60"/>
-              <w:right w:type="dxa" w:w="90"/>
-            </w:tcMar>
-            <w:vAlign w:val="center"/>
-          </w:tcPr>
-          <w:p>
-            <w:pPr>
-              <w:spacing w:after="20" w:line="252"/>
-              <w:jc w:val="left"/>
-            </w:pPr>
-            <w:r>
-              <w:rPr>
-                <w:b w:val="false"/>
-                <w:bCs w:val="false"/>
-                <w:color w:val="222222"/>
-                <w:sz w:val="19"/>
-                <w:szCs w:val="19"/>
-                <w:rFonts w:ascii="Arial" w:cs="Arial" w:eastAsia="Arial" w:hAnsi="Arial"/>
-              </w:rPr>
-              <w:t xml:space="preserve">RN08</w:t>
-            </w:r>
-          </w:p>
-        </w:tc>
-        <w:tc>
-          <w:tcPr>
-            <w:shd w:fill="EEF2F7" w:val="clear"/>
-            <w:tcMar>
-              <w:top w:type="dxa" w:w="60"/>
-              <w:left w:type="dxa" w:w="90"/>
-              <w:bottom w:type="dxa" w:w="60"/>
-              <w:right w:type="dxa" w:w="90"/>
-            </w:tcMar>
-            <w:vAlign w:val="center"/>
-          </w:tcPr>
-          <w:p>
-            <w:pPr>
-              <w:spacing w:after="20" w:line="252"/>
-              <w:jc w:val="left"/>
-            </w:pPr>
-            <w:r>
-              <w:rPr>
-                <w:b w:val="false"/>
-                <w:bCs w:val="false"/>
-                <w:color w:val="222222"/>
-                <w:sz w:val="19"/>
-                <w:szCs w:val="19"/>
-                <w:rFonts w:ascii="Arial" w:cs="Arial" w:eastAsia="Arial" w:hAnsi="Arial"/>
-              </w:rPr>
-              <w:t xml:space="preserve">Alinhamento (08/2026): a Data de Preparação é alimentada apenas no ticket pai; a replicação para os filhos é configurada no Run2Biz (evita HTTP 409 no data-object do filho).</w:t>
-            </w:r>
-          </w:p>
-        </w:tc>
-      </w:tr>
-    </w:tbl>
-    <w:p>
-      <w:pPr>
-        <w:pBdr>
-          <w:bottom w:val="single" w:color="F291D6" w:sz="12" w:space="4"/>
-        </w:pBdr>
-        <w:spacing w:before="320" w:after="140"/>
-      </w:pPr>
-      <w:r>
-        <w:rPr>
-          <w:b/>
-          <w:bCs/>
-          <w:color w:val="1B3D6D"/>
-          <w:sz w:val="30"/>
-          <w:szCs w:val="30"/>
-          <w:rFonts w:ascii="Arial" w:cs="Arial" w:eastAsia="Arial" w:hAnsi="Arial"/>
-        </w:rPr>
-        <w:t xml:space="preserve">8. Ação "Avançar Para Preparação Finalizada" (EP → PF)</w:t>
+        <w:t xml:space="preserve">7. Ação "Avançar Para Preparação Finalizada" (EP → PF)</w:t>
       </w:r>
     </w:p>
     <w:p>
@@ -4900,7 +3910,7 @@
           <w:szCs w:val="30"/>
           <w:rFonts w:ascii="Arial" w:cs="Arial" w:eastAsia="Arial" w:hAnsi="Arial"/>
         </w:rPr>
-        <w:t xml:space="preserve">9. Ordem de deploy e rollback</w:t>
+        <w:t xml:space="preserve">8. Ordem de deploy e rollback</w:t>
       </w:r>
     </w:p>
     <w:p>
@@ -4971,7 +3981,25 @@
           <w:szCs w:val="21"/>
           <w:rFonts w:ascii="Arial" w:cs="Arial" w:eastAsia="Arial" w:hAnsi="Arial"/>
         </w:rPr>
-        <w:t xml:space="preserve"> (objeto #4).</w:t>
+        <w:t xml:space="preserve"> (objeto #1) — script </w:t>
+      </w:r>
+      <w:r>
+        <w:rPr>
+          <w:color w:val="1A1A1A"/>
+          <w:sz w:val="19"/>
+          <w:szCs w:val="19"/>
+          <w:rFonts w:ascii="Consolas" w:cs="Consolas" w:eastAsia="Consolas" w:hAnsi="Consolas"/>
+        </w:rPr>
+        <w:t xml:space="preserve">DOMINIO_STATUSPICKING_EX.sql</w:t>
+      </w:r>
+      <w:r>
+        <w:rPr>
+          <w:color w:val="222222"/>
+          <w:sz w:val="21"/>
+          <w:szCs w:val="21"/>
+          <w:rFonts w:ascii="Arial" w:cs="Arial" w:eastAsia="Arial" w:hAnsi="Arial"/>
+        </w:rPr>
+        <w:t xml:space="preserve">.</w:t>
       </w:r>
     </w:p>
     <w:p>
@@ -4990,7 +4018,7 @@
           <w:szCs w:val="21"/>
           <w:rFonts w:ascii="Arial" w:cs="Arial" w:eastAsia="Arial" w:hAnsi="Arial"/>
         </w:rPr>
-        <w:t xml:space="preserve">Criar a coluna </w:t>
+        <w:t xml:space="preserve">Subir o JAR </w:t>
       </w:r>
       <w:r>
         <w:rPr>
@@ -4999,16 +4027,16 @@
           <w:szCs w:val="19"/>
           <w:rFonts w:ascii="Consolas" w:cs="Consolas" w:eastAsia="Consolas" w:hAnsi="Consolas"/>
         </w:rPr>
-        <w:t xml:space="preserve">AD_PLANROL.DATA_PREPARACAO_INTEGRADA</w:t>
-      </w:r>
-      <w:r>
-        <w:rPr>
-          <w:color w:val="222222"/>
-          <w:sz w:val="21"/>
-          <w:szCs w:val="21"/>
-          <w:rFonts w:ascii="Arial" w:cs="Arial" w:eastAsia="Arial" w:hAnsi="Arial"/>
-        </w:rPr>
-        <w:t xml:space="preserve"> — de preferência pelo Dicionário de Dados (objeto #1).</w:t>
+        <w:t xml:space="preserve">voke230626.jar</w:t>
+      </w:r>
+      <w:r>
+        <w:rPr>
+          <w:color w:val="222222"/>
+          <w:sz w:val="21"/>
+          <w:szCs w:val="21"/>
+          <w:rFonts w:ascii="Arial" w:cs="Arial" w:eastAsia="Arial" w:hAnsi="Arial"/>
+        </w:rPr>
+        <w:t xml:space="preserve"> no módulo 52.</w:t>
       </w:r>
     </w:p>
     <w:p>
@@ -5027,80 +4055,27 @@
           <w:szCs w:val="21"/>
           <w:rFonts w:ascii="Arial" w:cs="Arial" w:eastAsia="Arial" w:hAnsi="Arial"/>
         </w:rPr>
-        <w:t xml:space="preserve">Aplicar / substituir a view </w:t>
-      </w:r>
-      <w:r>
-        <w:rPr>
-          <w:color w:val="1A1A1A"/>
-          <w:sz w:val="19"/>
-          <w:szCs w:val="19"/>
-          <w:rFonts w:ascii="Consolas" w:cs="Consolas" w:eastAsia="Consolas" w:hAnsi="Consolas"/>
-        </w:rPr>
-        <w:t xml:space="preserve">VIEW_VOKE_ITSM_ATIVACAO_PEDIDO</w:t>
-      </w:r>
-      <w:r>
-        <w:rPr>
-          <w:color w:val="222222"/>
-          <w:sz w:val="21"/>
-          <w:szCs w:val="21"/>
-          <w:rFonts w:ascii="Arial" w:cs="Arial" w:eastAsia="Arial" w:hAnsi="Arial"/>
-        </w:rPr>
-        <w:t xml:space="preserve"> e a procedure </w:t>
-      </w:r>
-      <w:r>
-        <w:rPr>
-          <w:color w:val="1A1A1A"/>
-          <w:sz w:val="19"/>
-          <w:szCs w:val="19"/>
-          <w:rFonts w:ascii="Consolas" w:cs="Consolas" w:eastAsia="Consolas" w:hAnsi="Consolas"/>
-        </w:rPr>
-        <w:t xml:space="preserve">STP_AD_PLANROL_DTPRE</w:t>
-      </w:r>
-      <w:r>
-        <w:rPr>
-          <w:color w:val="222222"/>
-          <w:sz w:val="21"/>
-          <w:szCs w:val="21"/>
-          <w:rFonts w:ascii="Arial" w:cs="Arial" w:eastAsia="Arial" w:hAnsi="Arial"/>
-        </w:rPr>
-        <w:t xml:space="preserve"> (objetos #3 e #2).</w:t>
-      </w:r>
-    </w:p>
-    <w:p>
-      <w:pPr>
-        <w:pStyle w:val="ListParagraph"/>
-        <w:numPr>
-          <w:ilvl w:val="0"/>
-          <w:numId w:val="2"/>
-        </w:numPr>
-        <w:spacing w:after="60"/>
-      </w:pPr>
-      <w:r>
-        <w:rPr>
-          <w:color w:val="222222"/>
-          <w:sz w:val="21"/>
-          <w:szCs w:val="21"/>
-          <w:rFonts w:ascii="Arial" w:cs="Arial" w:eastAsia="Arial" w:hAnsi="Arial"/>
-        </w:rPr>
-        <w:t xml:space="preserve">Subir o JAR </w:t>
-      </w:r>
-      <w:r>
-        <w:rPr>
-          <w:color w:val="1A1A1A"/>
-          <w:sz w:val="19"/>
-          <w:szCs w:val="19"/>
-          <w:rFonts w:ascii="Consolas" w:cs="Consolas" w:eastAsia="Consolas" w:hAnsi="Consolas"/>
-        </w:rPr>
-        <w:t xml:space="preserve">voke230626.jar</w:t>
-      </w:r>
-      <w:r>
-        <w:rPr>
-          <w:color w:val="222222"/>
-          <w:sz w:val="21"/>
-          <w:szCs w:val="21"/>
-          <w:rFonts w:ascii="Arial" w:cs="Arial" w:eastAsia="Arial" w:hAnsi="Arial"/>
-        </w:rPr>
-        <w:t xml:space="preserve"> no módulo 52.</w:t>
+        <w:t xml:space="preserve">Configurar / validar a ação de tela </w:t>
+      </w:r>
+      <w:r>
+        <w:rPr>
+          <w:b/>
+          <w:bCs/>
+          <w:color w:val="222222"/>
+          <w:sz w:val="21"/>
+          <w:szCs w:val="21"/>
+          <w:rFonts w:ascii="Arial" w:cs="Arial" w:eastAsia="Arial" w:hAnsi="Arial"/>
+        </w:rPr>
+        <w:t xml:space="preserve">"Avançar Para Preparação Finalizada"</w:t>
+      </w:r>
+      <w:r>
+        <w:rPr>
+          <w:color w:val="222222"/>
+          <w:sz w:val="21"/>
+          <w:szCs w:val="21"/>
+          <w:rFonts w:ascii="Arial" w:cs="Arial" w:eastAsia="Arial" w:hAnsi="Arial"/>
+        </w:rPr>
+        <w:t xml:space="preserve"> (EP → PF) na tela Gerenciamento Integração.</w:t>
       </w:r>
     </w:p>
     <w:p>
@@ -5119,7 +4094,32 @@
           <w:szCs w:val="21"/>
           <w:rFonts w:ascii="Arial" w:cs="Arial" w:eastAsia="Arial" w:hAnsi="Arial"/>
         </w:rPr>
-        <w:t xml:space="preserve">Conferir/garantir as ações agendadas do módulo 52 (incluindo, se aplicável, a </w:t>
+        <w:t xml:space="preserve">Conferir as ações agendadas do módulo 52 (todas ativas).</w:t>
+      </w:r>
+    </w:p>
+    <w:p>
+      <w:pPr>
+        <w:spacing w:after="100" w:line="276"/>
+      </w:pPr>
+      <w:r>
+        <w:rPr>
+          <w:b/>
+          <w:bCs/>
+          <w:color w:val="222222"/>
+          <w:sz w:val="21"/>
+          <w:szCs w:val="21"/>
+          <w:rFonts w:ascii="Arial" w:cs="Arial" w:eastAsia="Arial" w:hAnsi="Arial"/>
+        </w:rPr>
+        <w:t xml:space="preserve">Motivo da ordem: </w:t>
+      </w:r>
+      <w:r>
+        <w:rPr>
+          <w:color w:val="222222"/>
+          <w:sz w:val="21"/>
+          <w:szCs w:val="21"/>
+          <w:rFonts w:ascii="Arial" w:cs="Arial" w:eastAsia="Arial" w:hAnsi="Arial"/>
+        </w:rPr>
+        <w:t xml:space="preserve">o valor de domínio EX precisa existir antes do JAR — a tela Gerenciamento Integração depende dele para exibir corretamente o status gravado como </w:t>
       </w:r>
       <w:r>
         <w:rPr>
@@ -5128,59 +4128,16 @@
           <w:szCs w:val="19"/>
           <w:rFonts w:ascii="Consolas" w:cs="Consolas" w:eastAsia="Consolas" w:hAnsi="Consolas"/>
         </w:rPr>
-        <w:t xml:space="preserve">ScheduleEnviarPreparacaoITSM</w:t>
-      </w:r>
-      <w:r>
-        <w:rPr>
-          <w:color w:val="222222"/>
-          <w:sz w:val="21"/>
-          <w:szCs w:val="21"/>
-          <w:rFonts w:ascii="Arial" w:cs="Arial" w:eastAsia="Arial" w:hAnsi="Arial"/>
-        </w:rPr>
-        <w:t xml:space="preserve">).</w:t>
-      </w:r>
-    </w:p>
-    <w:p>
-      <w:pPr>
-        <w:spacing w:after="100" w:line="276"/>
-      </w:pPr>
-      <w:r>
-        <w:rPr>
-          <w:b/>
-          <w:bCs/>
-          <w:color w:val="222222"/>
-          <w:sz w:val="21"/>
-          <w:szCs w:val="21"/>
-          <w:rFonts w:ascii="Arial" w:cs="Arial" w:eastAsia="Arial" w:hAnsi="Arial"/>
-        </w:rPr>
-        <w:t xml:space="preserve">Motivo da ordem: </w:t>
-      </w:r>
-      <w:r>
-        <w:rPr>
-          <w:color w:val="222222"/>
-          <w:sz w:val="21"/>
-          <w:szCs w:val="21"/>
-          <w:rFonts w:ascii="Arial" w:cs="Arial" w:eastAsia="Arial" w:hAnsi="Arial"/>
-        </w:rPr>
-        <w:t xml:space="preserve">os valores de domínio e o campo precisam existir antes do JAR — a tela e o writeback (</w:t>
-      </w:r>
-      <w:r>
-        <w:rPr>
-          <w:color w:val="1A1A1A"/>
-          <w:sz w:val="19"/>
-          <w:szCs w:val="19"/>
-          <w:rFonts w:ascii="Consolas" w:cs="Consolas" w:eastAsia="Consolas" w:hAnsi="Consolas"/>
-        </w:rPr>
-        <w:t xml:space="preserve">JapeWrapper</w:t>
-      </w:r>
-      <w:r>
-        <w:rPr>
-          <w:color w:val="222222"/>
-          <w:sz w:val="21"/>
-          <w:szCs w:val="21"/>
-          <w:rFonts w:ascii="Arial" w:cs="Arial" w:eastAsia="Arial" w:hAnsi="Arial"/>
-        </w:rPr>
-        <w:t xml:space="preserve">) dependem deles.</w:t>
+        <w:t xml:space="preserve">EX</w:t>
+      </w:r>
+      <w:r>
+        <w:rPr>
+          <w:color w:val="222222"/>
+          <w:sz w:val="21"/>
+          <w:szCs w:val="21"/>
+          <w:rFonts w:ascii="Arial" w:cs="Arial" w:eastAsia="Arial" w:hAnsi="Arial"/>
+        </w:rPr>
+        <w:t xml:space="preserve">.</w:t>
       </w:r>
     </w:p>
     <w:p>
@@ -5256,7 +4213,7 @@
           <w:szCs w:val="21"/>
           <w:rFonts w:ascii="Arial" w:cs="Arial" w:eastAsia="Arial" w:hAnsi="Arial"/>
         </w:rPr>
-        <w:t xml:space="preserve">a opção de domínio EX e a coluna DATA_PREPARACAO_INTEGRADA são aditivas e idempotentes — não exigem reversão para o fluxo antigo voltar a operar; a view/procedure podem ser restauradas a partir da versão anterior versionada no Git.</w:t>
+        <w:t xml:space="preserve">a opção de domínio EX é aditiva e idempotente — não exige reversão para o fluxo antigo voltar a operar.</w:t>
       </w:r>
     </w:p>
     <w:p>
@@ -5280,7 +4237,7 @@
           <w:szCs w:val="30"/>
           <w:rFonts w:ascii="Arial" w:cs="Arial" w:eastAsia="Arial" w:hAnsi="Arial"/>
         </w:rPr>
-        <w:t xml:space="preserve">10. Evidências da subida (Produção)</w:t>
+        <w:t xml:space="preserve">9. Evidências da subida (Produção)</w:t>
       </w:r>
     </w:p>
     <w:p>
@@ -5814,7 +4771,7 @@
           <w:szCs w:val="30"/>
           <w:rFonts w:ascii="Arial" w:cs="Arial" w:eastAsia="Arial" w:hAnsi="Arial"/>
         </w:rPr>
-        <w:t xml:space="preserve">11. Pendências e próximos passos</w:t>
+        <w:t xml:space="preserve">10. Pendências e próximos passos</w:t>
       </w:r>
     </w:p>
     <w:p>
@@ -5874,27 +4831,62 @@
           <w:szCs w:val="21"/>
           <w:rFonts w:ascii="Arial" w:cs="Arial" w:eastAsia="Arial" w:hAnsi="Arial"/>
         </w:rPr>
-        <w:t xml:space="preserve">Confirmar o cadastro da </w:t>
-      </w:r>
+        <w:t xml:space="preserve">Acompanhar o comportamento do estado </w:t>
+      </w:r>
+      <w:r>
+        <w:rPr>
+          <w:color w:val="1A1A1A"/>
+          <w:sz w:val="19"/>
+          <w:szCs w:val="19"/>
+          <w:rFonts w:ascii="Consolas" w:cs="Consolas" w:eastAsia="Consolas" w:hAnsi="Consolas"/>
+        </w:rPr>
+        <w:t xml:space="preserve">EX</w:t>
+      </w:r>
+      <w:r>
+        <w:rPr>
+          <w:color w:val="222222"/>
+          <w:sz w:val="21"/>
+          <w:szCs w:val="21"/>
+          <w:rFonts w:ascii="Arial" w:cs="Arial" w:eastAsia="Arial" w:hAnsi="Arial"/>
+        </w:rPr>
+        <w:t xml:space="preserve"> (Expedição) no Gerenciamento Integração após a gravação pelo </w:t>
+      </w:r>
+      <w:r>
+        <w:rPr>
+          <w:color w:val="1A1A1A"/>
+          <w:sz w:val="19"/>
+          <w:szCs w:val="19"/>
+          <w:rFonts w:ascii="Consolas" w:cs="Consolas" w:eastAsia="Consolas" w:hAnsi="Consolas"/>
+        </w:rPr>
+        <w:t xml:space="preserve">ScheduleEnviarDadosNota</w:t>
+      </w:r>
+      <w:r>
+        <w:rPr>
+          <w:color w:val="222222"/>
+          <w:sz w:val="21"/>
+          <w:szCs w:val="21"/>
+          <w:rFonts w:ascii="Arial" w:cs="Arial" w:eastAsia="Arial" w:hAnsi="Arial"/>
+        </w:rPr>
+        <w:t xml:space="preserve">.</w:t>
+      </w:r>
+    </w:p>
+    <w:p>
+      <w:pPr>
+        <w:pBdr>
+          <w:bottom w:val="single" w:color="F291D6" w:sz="12" w:space="4"/>
+        </w:pBdr>
+        <w:spacing w:before="320" w:after="140"/>
+      </w:pPr>
       <w:r>
         <w:rPr>
           <w:b/>
           <w:bCs/>
-          <w:color w:val="222222"/>
-          <w:sz w:val="21"/>
-          <w:szCs w:val="21"/>
-          <w:rFonts w:ascii="Arial" w:cs="Arial" w:eastAsia="Arial" w:hAnsi="Arial"/>
-        </w:rPr>
-        <w:t xml:space="preserve">ScheduleEnviarPreparacaoITSM</w:t>
-      </w:r>
-      <w:r>
-        <w:rPr>
-          <w:color w:val="222222"/>
-          <w:sz w:val="21"/>
-          <w:szCs w:val="21"/>
-          <w:rFonts w:ascii="Arial" w:cs="Arial" w:eastAsia="Arial" w:hAnsi="Arial"/>
-        </w:rPr>
-        <w:t xml:space="preserve"> como Ação Agendada (Cenário B — Data de Preparação pós-criação do chamado).</w:t>
+          <w:color w:val="1B3D6D"/>
+          <w:sz w:val="30"/>
+          <w:szCs w:val="30"/>
+          <w:rFonts w:ascii="Arial" w:cs="Arial" w:eastAsia="Arial" w:hAnsi="Arial"/>
+        </w:rPr>
+        <w:t xml:space="preserve">11. Referências</w:t>
       </w:r>
     </w:p>
     <w:p>
@@ -5913,7 +4905,7 @@
           <w:szCs w:val="21"/>
           <w:rFonts w:ascii="Arial" w:cs="Arial" w:eastAsia="Arial" w:hAnsi="Arial"/>
         </w:rPr>
-        <w:t xml:space="preserve">Confirmar com o Run2Biz a criação/nome final do campo </w:t>
+        <w:t xml:space="preserve">Repositório: </w:t>
       </w:r>
       <w:r>
         <w:rPr>
@@ -5922,16 +4914,16 @@
           <w:szCs w:val="19"/>
           <w:rFonts w:ascii="Consolas" w:cs="Consolas" w:eastAsia="Consolas" w:hAnsi="Consolas"/>
         </w:rPr>
-        <w:t xml:space="preserve">data_preparacao</w:t>
-      </w:r>
-      <w:r>
-        <w:rPr>
-          <w:color w:val="222222"/>
-          <w:sz w:val="21"/>
-          <w:szCs w:val="21"/>
-          <w:rFonts w:ascii="Arial" w:cs="Arial" w:eastAsia="Arial" w:hAnsi="Arial"/>
-        </w:rPr>
-        <w:t xml:space="preserve"> (yyyy-MM-dd) para os testes ponta a ponta; se divergir, ajustar o </w:t>
+        <w:t xml:space="preserve">victorfeer/DevsVoke</w:t>
+      </w:r>
+      <w:r>
+        <w:rPr>
+          <w:color w:val="222222"/>
+          <w:sz w:val="21"/>
+          <w:szCs w:val="21"/>
+          <w:rFonts w:ascii="Arial" w:cs="Arial" w:eastAsia="Arial" w:hAnsi="Arial"/>
+        </w:rPr>
+        <w:t xml:space="preserve"> — </w:t>
       </w:r>
       <w:r>
         <w:rPr>
@@ -5940,16 +4932,7 @@
           <w:szCs w:val="19"/>
           <w:rFonts w:ascii="Consolas" w:cs="Consolas" w:eastAsia="Consolas" w:hAnsi="Consolas"/>
         </w:rPr>
-        <w:t xml:space="preserve">@SerializedName</w:t>
-      </w:r>
-      <w:r>
-        <w:rPr>
-          <w:color w:val="222222"/>
-          <w:sz w:val="21"/>
-          <w:szCs w:val="21"/>
-          <w:rFonts w:ascii="Arial" w:cs="Arial" w:eastAsia="Arial" w:hAnsi="Arial"/>
-        </w:rPr>
-        <w:t xml:space="preserve">.</w:t>
+        <w:t xml:space="preserve">sankhya/java/Integração Vokenex itsm/</w:t>
       </w:r>
     </w:p>
     <w:p>
@@ -5968,26 +4951,16 @@
           <w:szCs w:val="21"/>
           <w:rFonts w:ascii="Arial" w:cs="Arial" w:eastAsia="Arial" w:hAnsi="Arial"/>
         </w:rPr>
-        <w:t xml:space="preserve">Validar a replicação da Data de Preparação do ticket pai para os filhos (configuração do lado Run2Biz — RN08).</w:t>
-      </w:r>
-    </w:p>
-    <w:p>
-      <w:pPr>
-        <w:pBdr>
-          <w:bottom w:val="single" w:color="F291D6" w:sz="12" w:space="4"/>
-        </w:pBdr>
-        <w:spacing w:before="320" w:after="140"/>
-      </w:pPr>
-      <w:r>
-        <w:rPr>
-          <w:b/>
-          <w:bCs/>
-          <w:color w:val="1B3D6D"/>
-          <w:sz w:val="30"/>
-          <w:szCs w:val="30"/>
-          <w:rFonts w:ascii="Arial" w:cs="Arial" w:eastAsia="Arial" w:hAnsi="Arial"/>
-        </w:rPr>
-        <w:t xml:space="preserve">12. Referências</w:t>
+        <w:t xml:space="preserve">Objeto de banco: </w:t>
+      </w:r>
+      <w:r>
+        <w:rPr>
+          <w:color w:val="1A1A1A"/>
+          <w:sz w:val="19"/>
+          <w:szCs w:val="19"/>
+          <w:rFonts w:ascii="Consolas" w:cs="Consolas" w:eastAsia="Consolas" w:hAnsi="Consolas"/>
+        </w:rPr>
+        <w:t xml:space="preserve">voke/src/main/procedures/DOMINIO_STATUSPICKING_EX.sql</w:t>
       </w:r>
     </w:p>
     <w:p>
@@ -6006,99 +4979,7 @@
           <w:szCs w:val="21"/>
           <w:rFonts w:ascii="Arial" w:cs="Arial" w:eastAsia="Arial" w:hAnsi="Arial"/>
         </w:rPr>
-        <w:t xml:space="preserve">Repositório: </w:t>
-      </w:r>
-      <w:r>
-        <w:rPr>
-          <w:color w:val="1A1A1A"/>
-          <w:sz w:val="19"/>
-          <w:szCs w:val="19"/>
-          <w:rFonts w:ascii="Consolas" w:cs="Consolas" w:eastAsia="Consolas" w:hAnsi="Consolas"/>
-        </w:rPr>
-        <w:t xml:space="preserve">victorfeer/DevsVoke</w:t>
-      </w:r>
-      <w:r>
-        <w:rPr>
-          <w:color w:val="222222"/>
-          <w:sz w:val="21"/>
-          <w:szCs w:val="21"/>
-          <w:rFonts w:ascii="Arial" w:cs="Arial" w:eastAsia="Arial" w:hAnsi="Arial"/>
-        </w:rPr>
-        <w:t xml:space="preserve"> — </w:t>
-      </w:r>
-      <w:r>
-        <w:rPr>
-          <w:color w:val="1A1A1A"/>
-          <w:sz w:val="19"/>
-          <w:szCs w:val="19"/>
-          <w:rFonts w:ascii="Consolas" w:cs="Consolas" w:eastAsia="Consolas" w:hAnsi="Consolas"/>
-        </w:rPr>
-        <w:t xml:space="preserve">sankhya/java/Integração Vokenex itsm/</w:t>
-      </w:r>
-    </w:p>
-    <w:p>
-      <w:pPr>
-        <w:pStyle w:val="ListParagraph"/>
-        <w:numPr>
-          <w:ilvl w:val="0"/>
-          <w:numId w:val="1"/>
-        </w:numPr>
-        <w:spacing w:after="60" w:line="264"/>
-      </w:pPr>
-      <w:r>
-        <w:rPr>
-          <w:color w:val="222222"/>
-          <w:sz w:val="21"/>
-          <w:szCs w:val="21"/>
-          <w:rFonts w:ascii="Arial" w:cs="Arial" w:eastAsia="Arial" w:hAnsi="Arial"/>
-        </w:rPr>
-        <w:t xml:space="preserve">Objetos de banco: </w:t>
-      </w:r>
-      <w:r>
-        <w:rPr>
-          <w:color w:val="1A1A1A"/>
-          <w:sz w:val="19"/>
-          <w:szCs w:val="19"/>
-          <w:rFonts w:ascii="Consolas" w:cs="Consolas" w:eastAsia="Consolas" w:hAnsi="Consolas"/>
-        </w:rPr>
-        <w:t xml:space="preserve">voke/src/main/procedures/</w:t>
-      </w:r>
-    </w:p>
-    <w:p>
-      <w:pPr>
-        <w:pStyle w:val="ListParagraph"/>
-        <w:numPr>
-          <w:ilvl w:val="0"/>
-          <w:numId w:val="1"/>
-        </w:numPr>
-        <w:spacing w:after="60" w:line="264"/>
-      </w:pPr>
-      <w:r>
-        <w:rPr>
-          <w:color w:val="222222"/>
-          <w:sz w:val="21"/>
-          <w:szCs w:val="21"/>
-          <w:rFonts w:ascii="Arial" w:cs="Arial" w:eastAsia="Arial" w:hAnsi="Arial"/>
-        </w:rPr>
-        <w:t xml:space="preserve">Documentação técnica: </w:t>
-      </w:r>
-      <w:r>
-        <w:rPr>
-          <w:color w:val="1A1A1A"/>
-          <w:sz w:val="19"/>
-          <w:szCs w:val="19"/>
-          <w:rFonts w:ascii="Consolas" w:cs="Consolas" w:eastAsia="Consolas" w:hAnsi="Consolas"/>
-        </w:rPr>
-        <w:t xml:space="preserve">docs/data-preparacao.md</w:t>
-      </w:r>
-      <w:r>
-        <w:rPr>
-          <w:color w:val="222222"/>
-          <w:sz w:val="21"/>
-          <w:szCs w:val="21"/>
-          <w:rFonts w:ascii="Arial" w:cs="Arial" w:eastAsia="Arial" w:hAnsi="Arial"/>
-        </w:rPr>
-        <w:t xml:space="preserve">, </w:t>
+        <w:t xml:space="preserve">Documentação técnica da máquina de estados: </w:t>
       </w:r>
       <w:r>
         <w:rPr>

</xml_diff>